<commit_message>
mise a jour cahier des charges
</commit_message>
<xml_diff>
--- a/Cahier des charges.docx
+++ b/Cahier des charges.docx
@@ -195,13 +195,8 @@
               <w:jc w:val="center"/>
             </w:pPr>
             <w:r>
-              <w:t xml:space="preserve">Jouer à </w:t>
-            </w:r>
-            <w:proofErr w:type="spellStart"/>
-            <w:r>
-              <w:t>AppleCatcher</w:t>
-            </w:r>
-            <w:proofErr w:type="spellEnd"/>
+              <w:t>Jouer à AppleCatcher</w:t>
+            </w:r>
           </w:p>
         </w:tc>
         <w:tc>
@@ -215,13 +210,8 @@
               <w:jc w:val="center"/>
             </w:pPr>
             <w:r>
-              <w:t xml:space="preserve">Page d'accueil — </w:t>
-            </w:r>
-            <w:proofErr w:type="spellStart"/>
-            <w:r>
-              <w:t>AppleCatcher</w:t>
-            </w:r>
-            <w:proofErr w:type="spellEnd"/>
+              <w:t>Page d'accueil — AppleCatcher</w:t>
+            </w:r>
           </w:p>
         </w:tc>
       </w:tr>
@@ -237,13 +227,8 @@
               <w:jc w:val="center"/>
             </w:pPr>
             <w:r>
-              <w:t xml:space="preserve">Jouer à </w:t>
-            </w:r>
-            <w:proofErr w:type="spellStart"/>
-            <w:r>
-              <w:t>BrickBreak</w:t>
-            </w:r>
-            <w:proofErr w:type="spellEnd"/>
+              <w:t>Jouer à BrickBreak</w:t>
+            </w:r>
           </w:p>
         </w:tc>
         <w:tc>
@@ -257,13 +242,8 @@
               <w:jc w:val="center"/>
             </w:pPr>
             <w:r>
-              <w:t xml:space="preserve">Page d'accueil — </w:t>
-            </w:r>
-            <w:proofErr w:type="spellStart"/>
-            <w:r>
-              <w:t>BrickBreak</w:t>
-            </w:r>
-            <w:proofErr w:type="spellEnd"/>
+              <w:t>Page d'accueil — BrickBreak</w:t>
+            </w:r>
           </w:p>
         </w:tc>
       </w:tr>
@@ -311,13 +291,8 @@
               <w:jc w:val="center"/>
             </w:pPr>
             <w:r>
-              <w:t xml:space="preserve">Règles </w:t>
-            </w:r>
-            <w:proofErr w:type="spellStart"/>
-            <w:r>
-              <w:t>AppleCatcher</w:t>
-            </w:r>
-            <w:proofErr w:type="spellEnd"/>
+              <w:t>Règles AppleCatcher</w:t>
+            </w:r>
           </w:p>
         </w:tc>
         <w:tc>
@@ -331,13 +306,8 @@
               <w:jc w:val="center"/>
             </w:pPr>
             <w:r>
-              <w:t xml:space="preserve">Page Règles — </w:t>
-            </w:r>
-            <w:proofErr w:type="spellStart"/>
-            <w:r>
-              <w:t>AppleCatcher</w:t>
-            </w:r>
-            <w:proofErr w:type="spellEnd"/>
+              <w:t>Page Règles — AppleCatcher</w:t>
+            </w:r>
           </w:p>
         </w:tc>
       </w:tr>
@@ -353,13 +323,8 @@
               <w:jc w:val="center"/>
             </w:pPr>
             <w:r>
-              <w:t xml:space="preserve">Règles </w:t>
-            </w:r>
-            <w:proofErr w:type="spellStart"/>
-            <w:r>
-              <w:t>BrickBreak</w:t>
-            </w:r>
-            <w:proofErr w:type="spellEnd"/>
+              <w:t>Règles BrickBreak</w:t>
+            </w:r>
           </w:p>
         </w:tc>
         <w:tc>
@@ -373,13 +338,8 @@
               <w:jc w:val="center"/>
             </w:pPr>
             <w:r>
-              <w:t xml:space="preserve">Page Règles — </w:t>
-            </w:r>
-            <w:proofErr w:type="spellStart"/>
-            <w:r>
-              <w:t>BrickBreak</w:t>
-            </w:r>
-            <w:proofErr w:type="spellEnd"/>
+              <w:t>Page Règles — BrickBreak</w:t>
+            </w:r>
           </w:p>
         </w:tc>
       </w:tr>
@@ -514,13 +474,8 @@
               <w:jc w:val="center"/>
             </w:pPr>
             <w:r>
-              <w:t xml:space="preserve">Page d’explication du </w:t>
-            </w:r>
-            <w:proofErr w:type="spellStart"/>
-            <w:r>
-              <w:t>lore</w:t>
-            </w:r>
-            <w:proofErr w:type="spellEnd"/>
+              <w:t>Page d’explication du lore</w:t>
+            </w:r>
           </w:p>
         </w:tc>
       </w:tr>
@@ -556,7 +511,7 @@
     <w:p>
       <w:r>
         <w:pict w14:anchorId="4A4CA1C3">
-          <v:rect id="_x0000_i1199" style="width:0;height:1.5pt" o:hralign="center" o:hrstd="t" o:hr="t" fillcolor="#a0a0a0" stroked="f"/>
+          <v:rect id="_x0000_i1025" style="width:0;height:1.5pt" o:hralign="center" o:hrstd="t" o:hr="t" fillcolor="#a0a0a0" stroked="f"/>
         </w:pict>
       </w:r>
     </w:p>
@@ -778,7 +733,7 @@
     <w:p>
       <w:r>
         <w:pict w14:anchorId="78E681E4">
-          <v:rect id="_x0000_i1200" style="width:0;height:1.5pt" o:hralign="center" o:hrstd="t" o:hr="t" fillcolor="#a0a0a0" stroked="f"/>
+          <v:rect id="_x0000_i1026" style="width:0;height:1.5pt" o:hralign="center" o:hrstd="t" o:hr="t" fillcolor="#a0a0a0" stroked="f"/>
         </w:pict>
       </w:r>
     </w:p>
@@ -1015,7 +970,7 @@
     <w:p>
       <w:r>
         <w:pict w14:anchorId="3E11EFAE">
-          <v:rect id="_x0000_i1201" style="width:0;height:1.5pt" o:hralign="center" o:hrstd="t" o:hr="t" fillcolor="#a0a0a0" stroked="f"/>
+          <v:rect id="_x0000_i1027" style="width:0;height:1.5pt" o:hralign="center" o:hrstd="t" o:hr="t" fillcolor="#a0a0a0" stroked="f"/>
         </w:pict>
       </w:r>
     </w:p>
@@ -1088,7 +1043,7 @@
     <w:p>
       <w:r>
         <w:pict w14:anchorId="5124B6C2">
-          <v:rect id="_x0000_i1202" style="width:0;height:1.5pt" o:hralign="center" o:hrstd="t" o:hr="t" fillcolor="#a0a0a0" stroked="f"/>
+          <v:rect id="_x0000_i1028" style="width:0;height:1.5pt" o:hralign="center" o:hrstd="t" o:hr="t" fillcolor="#a0a0a0" stroked="f"/>
         </w:pict>
       </w:r>
     </w:p>
@@ -1310,7 +1265,7 @@
     <w:p>
       <w:r>
         <w:pict w14:anchorId="0884146F">
-          <v:rect id="_x0000_i1203" style="width:0;height:1.5pt" o:hralign="center" o:hrstd="t" o:hr="t" fillcolor="#a0a0a0" stroked="f"/>
+          <v:rect id="_x0000_i1029" style="width:0;height:1.5pt" o:hralign="center" o:hrstd="t" o:hr="t" fillcolor="#a0a0a0" stroked="f"/>
         </w:pict>
       </w:r>
     </w:p>
@@ -1600,20 +1555,8 @@
           <w:szCs w:val="32"/>
           <w:u w:val="single"/>
         </w:rPr>
-        <w:t xml:space="preserve">Jeu 1 — </w:t>
-      </w:r>
-      <w:proofErr w:type="spellStart"/>
-      <w:r>
-        <w:rPr>
-          <w:b/>
-          <w:bCs/>
-          <w:sz w:val="32"/>
-          <w:szCs w:val="32"/>
-          <w:u w:val="single"/>
-        </w:rPr>
-        <w:t>AppleCatcher</w:t>
-      </w:r>
-      <w:proofErr w:type="spellEnd"/>
+        <w:t>Jeu 1 — AppleCatcher</w:t>
+      </w:r>
     </w:p>
     <w:p>
       <w:pPr>
@@ -1638,7 +1581,7 @@
     <w:p>
       <w:r>
         <w:pict w14:anchorId="4324760E">
-          <v:rect id="_x0000_i1061" style="width:0;height:1.5pt" o:hralign="center" o:hrstd="t" o:hr="t" fillcolor="#a0a0a0" stroked="f"/>
+          <v:rect id="_x0000_i1030" style="width:0;height:1.5pt" o:hralign="center" o:hrstd="t" o:hr="t" fillcolor="#a0a0a0" stroked="f"/>
         </w:pict>
       </w:r>
     </w:p>
@@ -1665,7 +1608,7 @@
     <w:p>
       <w:r>
         <w:pict w14:anchorId="68D1CA41">
-          <v:rect id="_x0000_i1062" style="width:0;height:1.5pt" o:hralign="center" o:hrstd="t" o:hr="t" fillcolor="#a0a0a0" stroked="f"/>
+          <v:rect id="_x0000_i1031" style="width:0;height:1.5pt" o:hralign="center" o:hrstd="t" o:hr="t" fillcolor="#a0a0a0" stroked="f"/>
         </w:pict>
       </w:r>
     </w:p>
@@ -1744,7 +1687,7 @@
     <w:p>
       <w:r>
         <w:pict w14:anchorId="53491147">
-          <v:rect id="_x0000_i1063" style="width:0;height:1.5pt" o:hralign="center" o:hrstd="t" o:hr="t" fillcolor="#a0a0a0" stroked="f"/>
+          <v:rect id="_x0000_i1032" style="width:0;height:1.5pt" o:hralign="center" o:hrstd="t" o:hr="t" fillcolor="#a0a0a0" stroked="f"/>
         </w:pict>
       </w:r>
     </w:p>
@@ -1977,7 +1920,7 @@
     <w:p>
       <w:r>
         <w:pict w14:anchorId="3528BFB0">
-          <v:rect id="_x0000_i1064" style="width:0;height:1.5pt" o:hralign="center" o:hrstd="t" o:hr="t" fillcolor="#a0a0a0" stroked="f"/>
+          <v:rect id="_x0000_i1033" style="width:0;height:1.5pt" o:hralign="center" o:hrstd="t" o:hr="t" fillcolor="#a0a0a0" stroked="f"/>
         </w:pict>
       </w:r>
     </w:p>
@@ -2348,7 +2291,7 @@
     <w:p>
       <w:r>
         <w:pict w14:anchorId="774E962E">
-          <v:rect id="_x0000_i1065" style="width:0;height:1.5pt" o:hralign="center" o:hrstd="t" o:hr="t" fillcolor="#a0a0a0" stroked="f"/>
+          <v:rect id="_x0000_i1034" style="width:0;height:1.5pt" o:hralign="center" o:hrstd="t" o:hr="t" fillcolor="#a0a0a0" stroked="f"/>
         </w:pict>
       </w:r>
     </w:p>
@@ -2486,7 +2429,7 @@
     <w:p>
       <w:r>
         <w:pict w14:anchorId="1CE45B59">
-          <v:rect id="_x0000_i1066" style="width:0;height:1.5pt" o:hralign="center" o:hrstd="t" o:hr="t" fillcolor="#a0a0a0" stroked="f"/>
+          <v:rect id="_x0000_i1035" style="width:0;height:1.5pt" o:hralign="center" o:hrstd="t" o:hr="t" fillcolor="#a0a0a0" stroked="f"/>
         </w:pict>
       </w:r>
     </w:p>
@@ -2565,20 +2508,8 @@
           <w:szCs w:val="32"/>
           <w:u w:val="single"/>
         </w:rPr>
-        <w:t xml:space="preserve">Jeu 2 — </w:t>
-      </w:r>
-      <w:proofErr w:type="spellStart"/>
-      <w:r>
-        <w:rPr>
-          <w:b/>
-          <w:bCs/>
-          <w:sz w:val="32"/>
-          <w:szCs w:val="32"/>
-          <w:u w:val="single"/>
-        </w:rPr>
-        <w:t>BrickBreak</w:t>
-      </w:r>
-      <w:proofErr w:type="spellEnd"/>
+        <w:t>Jeu 2 — BrickBreak</w:t>
+      </w:r>
     </w:p>
     <w:p>
       <w:pPr>
@@ -2603,7 +2534,7 @@
     <w:p>
       <w:r>
         <w:pict w14:anchorId="5410B986">
-          <v:rect id="_x0000_i1109" style="width:0;height:1.5pt" o:hralign="center" o:hrstd="t" o:hr="t" fillcolor="#a0a0a0" stroked="f"/>
+          <v:rect id="_x0000_i1036" style="width:0;height:1.5pt" o:hralign="center" o:hrstd="t" o:hr="t" fillcolor="#a0a0a0" stroked="f"/>
         </w:pict>
       </w:r>
     </w:p>
@@ -2671,7 +2602,7 @@
     <w:p>
       <w:r>
         <w:pict w14:anchorId="20AA3701">
-          <v:rect id="_x0000_i1110" style="width:0;height:1.5pt" o:hralign="center" o:hrstd="t" o:hr="t" fillcolor="#a0a0a0" stroked="f"/>
+          <v:rect id="_x0000_i1037" style="width:0;height:1.5pt" o:hralign="center" o:hrstd="t" o:hr="t" fillcolor="#a0a0a0" stroked="f"/>
         </w:pict>
       </w:r>
     </w:p>
@@ -2972,7 +2903,7 @@
     <w:p>
       <w:r>
         <w:pict w14:anchorId="3D0CD55D">
-          <v:rect id="_x0000_i1111" style="width:0;height:1.5pt" o:hralign="center" o:hrstd="t" o:hr="t" fillcolor="#a0a0a0" stroked="f"/>
+          <v:rect id="_x0000_i1038" style="width:0;height:1.5pt" o:hralign="center" o:hrstd="t" o:hr="t" fillcolor="#a0a0a0" stroked="f"/>
         </w:pict>
       </w:r>
     </w:p>
@@ -3302,7 +3233,7 @@
     <w:p>
       <w:r>
         <w:pict w14:anchorId="30622CE0">
-          <v:rect id="_x0000_i1112" style="width:0;height:1.5pt" o:hralign="center" o:hrstd="t" o:hr="t" fillcolor="#a0a0a0" stroked="f"/>
+          <v:rect id="_x0000_i1039" style="width:0;height:1.5pt" o:hralign="center" o:hrstd="t" o:hr="t" fillcolor="#a0a0a0" stroked="f"/>
         </w:pict>
       </w:r>
     </w:p>
@@ -3365,7 +3296,7 @@
     <w:p>
       <w:r>
         <w:pict w14:anchorId="416049EB">
-          <v:rect id="_x0000_i1113" style="width:0;height:1.5pt" o:hralign="center" o:hrstd="t" o:hr="t" fillcolor="#a0a0a0" stroked="f"/>
+          <v:rect id="_x0000_i1040" style="width:0;height:1.5pt" o:hralign="center" o:hrstd="t" o:hr="t" fillcolor="#a0a0a0" stroked="f"/>
         </w:pict>
       </w:r>
     </w:p>
@@ -3433,7 +3364,7 @@
     <w:p>
       <w:r>
         <w:pict w14:anchorId="26008D38">
-          <v:rect id="_x0000_i1114" style="width:0;height:1.5pt" o:hralign="center" o:hrstd="t" o:hr="t" fillcolor="#a0a0a0" stroked="f"/>
+          <v:rect id="_x0000_i1041" style="width:0;height:1.5pt" o:hralign="center" o:hrstd="t" o:hr="t" fillcolor="#a0a0a0" stroked="f"/>
         </w:pict>
       </w:r>
     </w:p>
@@ -3537,7 +3468,7 @@
     <w:p>
       <w:r>
         <w:pict w14:anchorId="5D67B00A">
-          <v:rect id="_x0000_i1157" style="width:0;height:1.5pt" o:hralign="center" o:hrstd="t" o:hr="t" fillcolor="#a0a0a0" stroked="f"/>
+          <v:rect id="_x0000_i1042" style="width:0;height:1.5pt" o:hralign="center" o:hrstd="t" o:hr="t" fillcolor="#a0a0a0" stroked="f"/>
         </w:pict>
       </w:r>
     </w:p>
@@ -3648,7 +3579,7 @@
     <w:p>
       <w:r>
         <w:pict w14:anchorId="6DD96352">
-          <v:rect id="_x0000_i1158" style="width:0;height:1.5pt" o:hralign="center" o:hrstd="t" o:hr="t" fillcolor="#a0a0a0" stroked="f"/>
+          <v:rect id="_x0000_i1043" style="width:0;height:1.5pt" o:hralign="center" o:hrstd="t" o:hr="t" fillcolor="#a0a0a0" stroked="f"/>
         </w:pict>
       </w:r>
     </w:p>
@@ -3735,82 +3666,50 @@
           <w:i/>
           <w:iCs/>
         </w:rPr>
-        <w:t xml:space="preserve">(elle sert de </w:t>
-      </w:r>
-      <w:proofErr w:type="spellStart"/>
+        <w:t>(elle sert de cooldown de respawn)</w:t>
+      </w:r>
+    </w:p>
+    <w:p>
+      <w:r>
+        <w:pict w14:anchorId="47C42C03">
+          <v:rect id="_x0000_i1044" style="width:0;height:1.5pt" o:hralign="center" o:hrstd="t" o:hr="t" fillcolor="#a0a0a0" stroked="f"/>
+        </w:pict>
+      </w:r>
+    </w:p>
+    <w:p>
+      <w:pPr>
+        <w:rPr>
+          <w:b/>
+          <w:bCs/>
+        </w:rPr>
+      </w:pPr>
+      <w:r>
+        <w:rPr>
+          <w:b/>
+          <w:bCs/>
+        </w:rPr>
+        <w:t>Zones de jeu</w:t>
+      </w:r>
+    </w:p>
+    <w:p>
+      <w:r>
+        <w:t xml:space="preserve">Le terrain est divisé en </w:t>
+      </w:r>
+      <w:r>
+        <w:rPr>
+          <w:b/>
+          <w:bCs/>
+        </w:rPr>
+        <w:t>3 zones horizontales</w:t>
+      </w:r>
+      <w:r>
+        <w:t xml:space="preserve"> délimitées par un point </w:t>
+      </w:r>
       <w:r>
         <w:rPr>
           <w:i/>
           <w:iCs/>
         </w:rPr>
-        <w:t>cooldown</w:t>
-      </w:r>
-      <w:proofErr w:type="spellEnd"/>
-      <w:r>
-        <w:rPr>
-          <w:i/>
-          <w:iCs/>
-        </w:rPr>
-        <w:t xml:space="preserve"> de </w:t>
-      </w:r>
-      <w:proofErr w:type="spellStart"/>
-      <w:r>
-        <w:rPr>
-          <w:i/>
-          <w:iCs/>
-        </w:rPr>
-        <w:t>respawn</w:t>
-      </w:r>
-      <w:proofErr w:type="spellEnd"/>
-      <w:r>
-        <w:rPr>
-          <w:i/>
-          <w:iCs/>
-        </w:rPr>
-        <w:t>)</w:t>
-      </w:r>
-    </w:p>
-    <w:p>
-      <w:r>
-        <w:pict w14:anchorId="47C42C03">
-          <v:rect id="_x0000_i1159" style="width:0;height:1.5pt" o:hralign="center" o:hrstd="t" o:hr="t" fillcolor="#a0a0a0" stroked="f"/>
-        </w:pict>
-      </w:r>
-    </w:p>
-    <w:p>
-      <w:pPr>
-        <w:rPr>
-          <w:b/>
-          <w:bCs/>
-        </w:rPr>
-      </w:pPr>
-      <w:r>
-        <w:rPr>
-          <w:b/>
-          <w:bCs/>
-        </w:rPr>
-        <w:t>Zones de jeu</w:t>
-      </w:r>
-    </w:p>
-    <w:p>
-      <w:r>
-        <w:t xml:space="preserve">Le terrain est divisé en </w:t>
-      </w:r>
-      <w:r>
-        <w:rPr>
-          <w:b/>
-          <w:bCs/>
-        </w:rPr>
-        <w:t>3 zones horizontales</w:t>
-      </w:r>
-      <w:r>
-        <w:t xml:space="preserve"> délimitées par un point </w:t>
-      </w:r>
-      <w:r>
-        <w:rPr>
-          <w:i/>
-          <w:iCs/>
-        </w:rPr>
         <w:t>A</w:t>
       </w:r>
       <w:r>
@@ -3818,25 +3717,18 @@
       </w:r>
     </w:p>
     <w:p>
-      <w:proofErr w:type="gramStart"/>
       <w:r>
         <w:t xml:space="preserve">[  </w:t>
       </w:r>
       <w:r>
         <w:tab/>
       </w:r>
-      <w:proofErr w:type="gramEnd"/>
-      <w:r>
-        <w:t xml:space="preserve">Zone </w:t>
-      </w:r>
-      <w:proofErr w:type="gramStart"/>
-      <w:r>
-        <w:t xml:space="preserve">1  </w:t>
+      <w:r>
+        <w:t xml:space="preserve">Zone 1  </w:t>
       </w:r>
       <w:r>
         <w:tab/>
       </w:r>
-      <w:proofErr w:type="gramEnd"/>
       <w:r>
         <w:t xml:space="preserve">|   </w:t>
       </w:r>
@@ -3850,63 +3742,83 @@
         <w:tab/>
       </w:r>
       <w:r>
+        <w:t xml:space="preserve"> |  </w:t>
+      </w:r>
+      <w:r>
+        <w:tab/>
+      </w:r>
+      <w:r>
+        <w:t xml:space="preserve"> Zone 3  </w:t>
+      </w:r>
+      <w:r>
+        <w:tab/>
+      </w:r>
+      <w:r>
         <w:t xml:space="preserve"> </w:t>
       </w:r>
-      <w:proofErr w:type="gramStart"/>
-      <w:r>
-        <w:t xml:space="preserve">|  </w:t>
-      </w:r>
       <w:r>
         <w:tab/>
       </w:r>
-      <w:proofErr w:type="gramEnd"/>
-      <w:r>
-        <w:t xml:space="preserve"> Zone </w:t>
-      </w:r>
-      <w:proofErr w:type="gramStart"/>
-      <w:r>
-        <w:t xml:space="preserve">3  </w:t>
-      </w:r>
       <w:r>
         <w:tab/>
       </w:r>
-      <w:proofErr w:type="gramEnd"/>
+      <w:r>
+        <w:t xml:space="preserve"> ]</w:t>
+      </w:r>
       <w:r>
         <w:t xml:space="preserve"> </w:t>
       </w:r>
       <w:r>
+        <w:t>BASE</w:t>
+      </w:r>
+    </w:p>
+    <w:p>
+      <w:r>
+        <w:t xml:space="preserve"> Bordure   </w:t>
+      </w:r>
+      <w:r>
         <w:tab/>
       </w:r>
-      <w:proofErr w:type="gramStart"/>
+      <w:r>
+        <w:t xml:space="preserve"> </w:t>
+      </w:r>
       <w:r>
         <w:tab/>
       </w:r>
       <w:r>
-        <w:t xml:space="preserve"> ]</w:t>
-      </w:r>
-      <w:proofErr w:type="gramEnd"/>
+        <w:t xml:space="preserve">A             </w:t>
+      </w:r>
+      <w:r>
+        <w:tab/>
+      </w:r>
+      <w:r>
+        <w:tab/>
+      </w:r>
+      <w:r>
+        <w:t xml:space="preserve">Pointe du        </w:t>
+      </w:r>
+      <w:r>
+        <w:tab/>
+      </w:r>
+      <w:r>
+        <w:tab/>
+      </w:r>
       <w:r>
         <w:t xml:space="preserve"> </w:t>
       </w:r>
       <w:r>
-        <w:t>BASE</w:t>
-      </w:r>
-    </w:p>
-    <w:p>
-      <w:r>
-        <w:t xml:space="preserve"> Bordure   </w:t>
-      </w:r>
-      <w:r>
         <w:tab/>
       </w:r>
       <w:r>
-        <w:t xml:space="preserve"> </w:t>
-      </w:r>
-      <w:r>
         <w:tab/>
       </w:r>
       <w:r>
-        <w:t xml:space="preserve">A             </w:t>
+        <w:t>Mur</w:t>
+      </w:r>
+    </w:p>
+    <w:p>
+      <w:r>
+        <w:t xml:space="preserve"> droite                  </w:t>
       </w:r>
       <w:r>
         <w:tab/>
@@ -3915,16 +3827,13 @@
         <w:tab/>
       </w:r>
       <w:r>
-        <w:t xml:space="preserve">Pointe du        </w:t>
-      </w:r>
-      <w:r>
         <w:tab/>
       </w:r>
       <w:r>
         <w:tab/>
       </w:r>
       <w:r>
-        <w:t xml:space="preserve"> </w:t>
+        <w:t xml:space="preserve"> vaisseau        </w:t>
       </w:r>
       <w:r>
         <w:tab/>
@@ -3933,50 +3842,11 @@
         <w:tab/>
       </w:r>
       <w:r>
-        <w:t>Mur</w:t>
-      </w:r>
-    </w:p>
-    <w:p>
-      <w:r>
-        <w:t xml:space="preserve"> </w:t>
-      </w:r>
-      <w:proofErr w:type="gramStart"/>
-      <w:r>
-        <w:t>droite</w:t>
-      </w:r>
-      <w:proofErr w:type="gramEnd"/>
-      <w:r>
-        <w:t xml:space="preserve">                  </w:t>
+        <w:t xml:space="preserve">  </w:t>
       </w:r>
       <w:r>
         <w:tab/>
       </w:r>
-      <w:r>
-        <w:tab/>
-      </w:r>
-      <w:r>
-        <w:tab/>
-      </w:r>
-      <w:r>
-        <w:tab/>
-      </w:r>
-      <w:r>
-        <w:t xml:space="preserve"> vaisseau        </w:t>
-      </w:r>
-      <w:r>
-        <w:tab/>
-      </w:r>
-      <w:proofErr w:type="gramStart"/>
-      <w:r>
-        <w:tab/>
-      </w:r>
-      <w:r>
-        <w:t xml:space="preserve">  </w:t>
-      </w:r>
-      <w:r>
-        <w:tab/>
-      </w:r>
-      <w:proofErr w:type="gramEnd"/>
       <w:r>
         <w:tab/>
       </w:r>
@@ -4270,7 +4140,7 @@
     <w:p>
       <w:r>
         <w:pict w14:anchorId="4BD9463B">
-          <v:rect id="_x0000_i1160" style="width:0;height:1.5pt" o:hralign="center" o:hrstd="t" o:hr="t" fillcolor="#a0a0a0" stroked="f"/>
+          <v:rect id="_x0000_i1045" style="width:0;height:1.5pt" o:hralign="center" o:hrstd="t" o:hr="t" fillcolor="#a0a0a0" stroked="f"/>
         </w:pict>
       </w:r>
     </w:p>
@@ -4685,7 +4555,7 @@
     <w:p>
       <w:r>
         <w:pict w14:anchorId="696828C9">
-          <v:rect id="_x0000_i1161" style="width:0;height:1.5pt" o:hralign="center" o:hrstd="t" o:hr="t" fillcolor="#a0a0a0" stroked="f"/>
+          <v:rect id="_x0000_i1046" style="width:0;height:1.5pt" o:hralign="center" o:hrstd="t" o:hr="t" fillcolor="#a0a0a0" stroked="f"/>
         </w:pict>
       </w:r>
     </w:p>
@@ -4706,13 +4576,7 @@
     </w:p>
     <w:p>
       <w:r>
-        <w:rPr>
-          <w:rFonts w:ascii="Segoe UI Emoji" w:hAnsi="Segoe UI Emoji" w:cs="Segoe UI Emoji"/>
-        </w:rPr>
-        <w:t>⚠️</w:t>
-      </w:r>
-      <w:r>
-        <w:t xml:space="preserve"> Les stats ci-dessous sont des valeurs de départ. La vie, les dégâts, la vitesse et le taux d'apparition </w:t>
+        <w:t xml:space="preserve">Les stats ci-dessous sont des valeurs de départ. La vie, les dégâts, la vitesse et le taux d'apparition </w:t>
       </w:r>
       <w:r>
         <w:rPr>
@@ -4725,6 +4589,10 @@
         <w:t xml:space="preserve"> au fil de la partie.</w:t>
       </w:r>
     </w:p>
+    <w:p/>
+    <w:p/>
+    <w:p/>
+    <w:p/>
     <w:tbl>
       <w:tblPr>
         <w:tblStyle w:val="Grilledutableau"/>
@@ -4732,13 +4600,13 @@
         <w:tblLook w:val="04A0" w:firstRow="1" w:lastRow="0" w:firstColumn="1" w:lastColumn="0" w:noHBand="0" w:noVBand="1"/>
       </w:tblPr>
       <w:tblGrid>
-        <w:gridCol w:w="1260"/>
-        <w:gridCol w:w="1269"/>
-        <w:gridCol w:w="1161"/>
-        <w:gridCol w:w="1281"/>
-        <w:gridCol w:w="1355"/>
-        <w:gridCol w:w="1472"/>
-        <w:gridCol w:w="1264"/>
+        <w:gridCol w:w="1247"/>
+        <w:gridCol w:w="1356"/>
+        <w:gridCol w:w="1149"/>
+        <w:gridCol w:w="1266"/>
+        <w:gridCol w:w="1340"/>
+        <w:gridCol w:w="1455"/>
+        <w:gridCol w:w="1249"/>
       </w:tblGrid>
       <w:tr>
         <w:tc>
@@ -5043,78 +4911,66 @@
               <w:jc w:val="center"/>
             </w:pPr>
             <w:r>
-              <w:t>2/coup + gel 2s</w:t>
-            </w:r>
-          </w:p>
-        </w:tc>
-        <w:tc>
-          <w:tcPr>
-            <w:tcW w:w="0" w:type="auto"/>
-            <w:hideMark/>
-          </w:tcPr>
-          <w:p>
-            <w:pPr>
-              <w:spacing w:after="160" w:line="278" w:lineRule="auto"/>
-              <w:jc w:val="center"/>
-            </w:pPr>
-            <w:r>
-              <w:t xml:space="preserve">1/coup + 0,5/s </w:t>
-            </w:r>
-            <w:r>
-              <w:lastRenderedPageBreak/>
-              <w:t>pendant 4s</w:t>
-            </w:r>
-          </w:p>
-        </w:tc>
-        <w:tc>
-          <w:tcPr>
-            <w:tcW w:w="0" w:type="auto"/>
-            <w:hideMark/>
-          </w:tcPr>
-          <w:p>
-            <w:pPr>
-              <w:spacing w:after="160" w:line="278" w:lineRule="auto"/>
-              <w:jc w:val="center"/>
-            </w:pPr>
-            <w:r>
-              <w:lastRenderedPageBreak/>
-              <w:t xml:space="preserve">Utilise les attaques de M1, </w:t>
-            </w:r>
-            <w:r>
-              <w:lastRenderedPageBreak/>
-              <w:t>M2, M5, M6</w:t>
-            </w:r>
-          </w:p>
-          <w:p>
-            <w:pPr>
-              <w:spacing w:after="160" w:line="278" w:lineRule="auto"/>
-              <w:jc w:val="center"/>
-            </w:pPr>
-            <w:r>
-              <w:t>(</w:t>
-            </w:r>
-            <w:proofErr w:type="gramStart"/>
-            <w:r>
-              <w:t>peut</w:t>
-            </w:r>
-            <w:proofErr w:type="gramEnd"/>
-            <w:r>
-              <w:t>-être un bonus de dégât)</w:t>
-            </w:r>
-          </w:p>
-        </w:tc>
-        <w:tc>
-          <w:tcPr>
-            <w:tcW w:w="0" w:type="auto"/>
-            <w:hideMark/>
-          </w:tcPr>
-          <w:p>
-            <w:pPr>
-              <w:spacing w:after="160" w:line="278" w:lineRule="auto"/>
-              <w:jc w:val="center"/>
-            </w:pPr>
-            <w:r>
-              <w:lastRenderedPageBreak/>
+              <w:t xml:space="preserve">2/coup + </w:t>
+            </w:r>
+            <w:r>
+              <w:t>immobilise</w:t>
+            </w:r>
+            <w:r>
+              <w:t xml:space="preserve"> 2s</w:t>
+            </w:r>
+          </w:p>
+        </w:tc>
+        <w:tc>
+          <w:tcPr>
+            <w:tcW w:w="0" w:type="auto"/>
+            <w:hideMark/>
+          </w:tcPr>
+          <w:p>
+            <w:pPr>
+              <w:spacing w:after="160" w:line="278" w:lineRule="auto"/>
+              <w:jc w:val="center"/>
+            </w:pPr>
+            <w:r>
+              <w:t>1/coup + 0,5/s pendant 4s</w:t>
+            </w:r>
+          </w:p>
+        </w:tc>
+        <w:tc>
+          <w:tcPr>
+            <w:tcW w:w="0" w:type="auto"/>
+            <w:hideMark/>
+          </w:tcPr>
+          <w:p>
+            <w:pPr>
+              <w:spacing w:after="160" w:line="278" w:lineRule="auto"/>
+              <w:jc w:val="center"/>
+            </w:pPr>
+            <w:r>
+              <w:t>Utilise les attaques de M1, M2, M5, M6</w:t>
+            </w:r>
+          </w:p>
+          <w:p>
+            <w:pPr>
+              <w:spacing w:after="160" w:line="278" w:lineRule="auto"/>
+              <w:jc w:val="center"/>
+            </w:pPr>
+            <w:r>
+              <w:t>(peut-être un bonus de dégât)</w:t>
+            </w:r>
+          </w:p>
+        </w:tc>
+        <w:tc>
+          <w:tcPr>
+            <w:tcW w:w="0" w:type="auto"/>
+            <w:hideMark/>
+          </w:tcPr>
+          <w:p>
+            <w:pPr>
+              <w:spacing w:after="160" w:line="278" w:lineRule="auto"/>
+              <w:jc w:val="center"/>
+            </w:pPr>
+            <w:r>
               <w:t>5 (explosion)</w:t>
             </w:r>
           </w:p>
@@ -5371,11 +5227,9 @@
               <w:spacing w:after="160" w:line="278" w:lineRule="auto"/>
               <w:jc w:val="center"/>
             </w:pPr>
-            <w:proofErr w:type="gramStart"/>
             <w:r>
               <w:t>faible</w:t>
             </w:r>
-            <w:proofErr w:type="gramEnd"/>
           </w:p>
         </w:tc>
         <w:tc>
@@ -5542,126 +5396,117 @@
                 <w:b/>
                 <w:bCs/>
               </w:rPr>
-              <w:t xml:space="preserve">Taux de </w:t>
-            </w:r>
-            <w:proofErr w:type="spellStart"/>
+              <w:t>Taux de spawn</w:t>
+            </w:r>
+          </w:p>
+        </w:tc>
+        <w:tc>
+          <w:tcPr>
+            <w:tcW w:w="0" w:type="auto"/>
+            <w:hideMark/>
+          </w:tcPr>
+          <w:p>
+            <w:pPr>
+              <w:spacing w:after="160" w:line="278" w:lineRule="auto"/>
+              <w:jc w:val="center"/>
+            </w:pPr>
+            <w:r>
+              <w:t>Moyen</w:t>
+            </w:r>
+          </w:p>
+        </w:tc>
+        <w:tc>
+          <w:tcPr>
+            <w:tcW w:w="0" w:type="auto"/>
+            <w:hideMark/>
+          </w:tcPr>
+          <w:p>
+            <w:pPr>
+              <w:spacing w:after="160" w:line="278" w:lineRule="auto"/>
+              <w:jc w:val="center"/>
+            </w:pPr>
+            <w:r>
+              <w:t>Moyen</w:t>
+            </w:r>
+          </w:p>
+        </w:tc>
+        <w:tc>
+          <w:tcPr>
+            <w:tcW w:w="0" w:type="auto"/>
+            <w:hideMark/>
+          </w:tcPr>
+          <w:p>
+            <w:pPr>
+              <w:spacing w:after="160" w:line="278" w:lineRule="auto"/>
+              <w:jc w:val="center"/>
+            </w:pPr>
+            <w:r>
+              <w:t>Faible</w:t>
+            </w:r>
+          </w:p>
+        </w:tc>
+        <w:tc>
+          <w:tcPr>
+            <w:tcW w:w="0" w:type="auto"/>
+            <w:hideMark/>
+          </w:tcPr>
+          <w:p>
+            <w:pPr>
+              <w:spacing w:after="160" w:line="278" w:lineRule="auto"/>
+              <w:jc w:val="center"/>
+            </w:pPr>
+            <w:r>
+              <w:t>Élevé</w:t>
+            </w:r>
+          </w:p>
+        </w:tc>
+        <w:tc>
+          <w:tcPr>
+            <w:tcW w:w="0" w:type="auto"/>
+            <w:hideMark/>
+          </w:tcPr>
+          <w:p>
+            <w:pPr>
+              <w:spacing w:after="160" w:line="278" w:lineRule="auto"/>
+              <w:jc w:val="center"/>
+            </w:pPr>
+            <w:r>
+              <w:t>Moyen</w:t>
+            </w:r>
+          </w:p>
+        </w:tc>
+        <w:tc>
+          <w:tcPr>
+            <w:tcW w:w="0" w:type="auto"/>
+            <w:hideMark/>
+          </w:tcPr>
+          <w:p>
+            <w:pPr>
+              <w:spacing w:after="160" w:line="278" w:lineRule="auto"/>
+              <w:jc w:val="center"/>
+            </w:pPr>
+            <w:r>
+              <w:t>Moyen</w:t>
+            </w:r>
+          </w:p>
+        </w:tc>
+      </w:tr>
+      <w:tr>
+        <w:tc>
+          <w:tcPr>
+            <w:tcW w:w="0" w:type="auto"/>
+            <w:hideMark/>
+          </w:tcPr>
+          <w:p>
+            <w:pPr>
+              <w:spacing w:after="160" w:line="278" w:lineRule="auto"/>
+              <w:jc w:val="center"/>
+            </w:pPr>
             <w:r>
               <w:rPr>
                 <w:b/>
                 <w:bCs/>
               </w:rPr>
-              <w:t>spawn</w:t>
-            </w:r>
-            <w:proofErr w:type="spellEnd"/>
-          </w:p>
-        </w:tc>
-        <w:tc>
-          <w:tcPr>
-            <w:tcW w:w="0" w:type="auto"/>
-            <w:hideMark/>
-          </w:tcPr>
-          <w:p>
-            <w:pPr>
-              <w:spacing w:after="160" w:line="278" w:lineRule="auto"/>
-              <w:jc w:val="center"/>
-            </w:pPr>
-            <w:r>
-              <w:t>Moyen</w:t>
-            </w:r>
-          </w:p>
-        </w:tc>
-        <w:tc>
-          <w:tcPr>
-            <w:tcW w:w="0" w:type="auto"/>
-            <w:hideMark/>
-          </w:tcPr>
-          <w:p>
-            <w:pPr>
-              <w:spacing w:after="160" w:line="278" w:lineRule="auto"/>
-              <w:jc w:val="center"/>
-            </w:pPr>
-            <w:r>
-              <w:t>Moyen</w:t>
-            </w:r>
-          </w:p>
-        </w:tc>
-        <w:tc>
-          <w:tcPr>
-            <w:tcW w:w="0" w:type="auto"/>
-            <w:hideMark/>
-          </w:tcPr>
-          <w:p>
-            <w:pPr>
-              <w:spacing w:after="160" w:line="278" w:lineRule="auto"/>
-              <w:jc w:val="center"/>
-            </w:pPr>
-            <w:r>
-              <w:t>Faible</w:t>
-            </w:r>
-          </w:p>
-        </w:tc>
-        <w:tc>
-          <w:tcPr>
-            <w:tcW w:w="0" w:type="auto"/>
-            <w:hideMark/>
-          </w:tcPr>
-          <w:p>
-            <w:pPr>
-              <w:spacing w:after="160" w:line="278" w:lineRule="auto"/>
-              <w:jc w:val="center"/>
-            </w:pPr>
-            <w:r>
-              <w:t>Élevé</w:t>
-            </w:r>
-          </w:p>
-        </w:tc>
-        <w:tc>
-          <w:tcPr>
-            <w:tcW w:w="0" w:type="auto"/>
-            <w:hideMark/>
-          </w:tcPr>
-          <w:p>
-            <w:pPr>
-              <w:spacing w:after="160" w:line="278" w:lineRule="auto"/>
-              <w:jc w:val="center"/>
-            </w:pPr>
-            <w:r>
-              <w:t>Moyen</w:t>
-            </w:r>
-          </w:p>
-        </w:tc>
-        <w:tc>
-          <w:tcPr>
-            <w:tcW w:w="0" w:type="auto"/>
-            <w:hideMark/>
-          </w:tcPr>
-          <w:p>
-            <w:pPr>
-              <w:spacing w:after="160" w:line="278" w:lineRule="auto"/>
-              <w:jc w:val="center"/>
-            </w:pPr>
-            <w:r>
-              <w:t>Moyen</w:t>
-            </w:r>
-          </w:p>
-        </w:tc>
-      </w:tr>
-      <w:tr>
-        <w:tc>
-          <w:tcPr>
-            <w:tcW w:w="0" w:type="auto"/>
-            <w:hideMark/>
-          </w:tcPr>
-          <w:p>
-            <w:pPr>
-              <w:spacing w:after="160" w:line="278" w:lineRule="auto"/>
-              <w:jc w:val="center"/>
-            </w:pPr>
-            <w:r>
-              <w:rPr>
-                <w:b/>
-                <w:bCs/>
-              </w:rPr>
               <w:t>Bonus droppé</w:t>
             </w:r>
           </w:p>
@@ -5768,7 +5613,7 @@
     <w:p>
       <w:r>
         <w:pict w14:anchorId="5BF1A1AD">
-          <v:rect id="_x0000_i1162" style="width:0;height:1.5pt" o:hralign="center" o:hrstd="t" o:hr="t" fillcolor="#a0a0a0" stroked="f"/>
+          <v:rect id="_x0000_i1047" style="width:0;height:1.5pt" o:hralign="center" o:hrstd="t" o:hr="t" fillcolor="#a0a0a0" stroked="f"/>
         </w:pict>
       </w:r>
     </w:p>
@@ -8561,6 +8406,7 @@
   <w:style w:type="character" w:default="1" w:styleId="Policepardfaut">
     <w:name w:val="Default Paragraph Font"/>
     <w:uiPriority w:val="1"/>
+    <w:semiHidden/>
     <w:unhideWhenUsed/>
   </w:style>
   <w:style w:type="table" w:default="1" w:styleId="TableauNormal">

</xml_diff>